<commit_message>
feat(c02): sincronizare identitate FILM->HTML + mapare canonica
Sincronizat in toate cele 4 machete C02 (Studiu/Editor-Studiu/Video/Editor-Video):
- INTRIGA -> cover-subtitle + hero-hook
- MIZA -> cover-miza
- MANTRA -> mantra-band-main
- MOTTO -> payoff-motto + final-motto + exec-closing-motto
Identitate aliniata si in FILM-ul din repo (master), corp voce noi pastrat.

Document nou _system/10-MAP-FILM-HTML.md: mapare canonica camp FILM -> slot HTML
pentru ca 'update html' sa devina mecanic. WOW ramane fara slot (optiune A/B pending).
</commit_message>
<xml_diff>
--- a/c02/FILM-Excel-02-Marcare.docx
+++ b/c02/FILM-Excel-02-Marcare.docx
@@ -68,7 +68,7 @@
           <w:rFonts w:ascii="Calibri" w:hAnsi="Calibri"/>
           <w:sz w:val="20"/>
         </w:rPr>
-        <w:t>Tabelul cu date pare curat. Datele insa mint.</w:t>
+        <w:t>Tabelul cu date pare curat. Datele însă mint.</w:t>
       </w:r>
     </w:p>
     <w:p>
@@ -92,7 +92,7 @@
           <w:rFonts w:ascii="Calibri" w:hAnsi="Calibri"/>
           <w:sz w:val="20"/>
         </w:rPr>
-        <w:t>Tabelul a fost predat de C01 ca structura corecta. Datele insa contin anomalii operationale invizibile la prima privire: facturi datate in viitor, coduri client inexistente, duplicate exacte, vanzari sambata pe filiala L-V, campuri obligatorii goale.</w:t>
+        <w:t>Obținem un set auditat. Fiecare anomalie este identificată, explicată și urmărită până la rezolvare.</w:t>
       </w:r>
     </w:p>
     <w:p>
@@ -116,7 +116,7 @@
           <w:rFonts w:ascii="Calibri" w:hAnsi="Calibri"/>
           <w:sz w:val="20"/>
         </w:rPr>
-        <w:t>Inainte de orice raport, controlul.</w:t>
+        <w:t>Înainte de orice raport, controlul.</w:t>
       </w:r>
     </w:p>
     <w:p>
@@ -140,7 +140,7 @@
           <w:rFonts w:ascii="Calibri" w:hAnsi="Calibri"/>
           <w:sz w:val="20"/>
         </w:rPr>
-        <w:t>Tabelul are acum doua coloane noi: STATUS si MOTIV. Fiecare anomalie e marcata, motivata, audi tabila.</w:t>
+        <w:t>Nimic nu mai este suspect. Totul este marcat.</w:t>
       </w:r>
     </w:p>
     <w:p>
@@ -152,7 +152,7 @@
           <w:b/>
           <w:sz w:val="26"/>
         </w:rPr>
-        <w:t>MOTTO (SEMNATURA)</w:t>
+        <w:t>MOTTO (SEMNĂTURĂ)</w:t>
       </w:r>
     </w:p>
     <w:p>
@@ -164,7 +164,7 @@
           <w:rFonts w:ascii="Calibri" w:hAnsi="Calibri"/>
           <w:sz w:val="20"/>
         </w:rPr>
-        <w:t>Nu reconstruim tabelul. Il facem controlabil.</w:t>
+        <w:t>Încrederea începe după verificare.</w:t>
       </w:r>
     </w:p>
     <w:p>

</xml_diff>

<commit_message>
sync(c02): FILM<-HTML MIZA strategica + WOW 'Raportul nu mai inghite minciuna' (R-V46 FILM=master aliniat)
</commit_message>
<xml_diff>
--- a/c02/FILM-Excel-02-Marcare.docx
+++ b/c02/FILM-Excel-02-Marcare.docx
@@ -92,7 +92,7 @@
           <w:rFonts w:ascii="Calibri" w:hAnsi="Calibri"/>
           <w:sz w:val="20"/>
         </w:rPr>
-        <w:t>Obținem un set auditat. Fiecare anomalie este identificată, explicată și urmărită până la rezolvare.</w:t>
+        <w:t>Datele valide pot produce rapoarte false. C02 oprește minciuna înainte să ajungă în KPI, dashboard și decizie: fiecare rând suspect rămâne vizibil, motivat și trasabil.</w:t>
       </w:r>
     </w:p>
     <w:p>
@@ -140,7 +140,7 @@
           <w:rFonts w:ascii="Calibri" w:hAnsi="Calibri"/>
           <w:sz w:val="20"/>
         </w:rPr>
-        <w:t>Nimic nu mai este suspect. Totul este marcat.</w:t>
+        <w:t>Raportul nu mai înghite minciuna. O marchează.</w:t>
       </w:r>
     </w:p>
     <w:p>

</xml_diff>

<commit_message>
docs(film): back-port arc TU Studiu->FILM (C02/C03) + MIZA C04 + actualizare mapare
Sync FILM<-Studiu cerut de ARHITECT: FILM sa contina informatia actualizata din
HTML-Studiu. Verificat slot cu slot C01-C04 (MANTRA/WOW/MOTTO erau sincrone).
- C02 + C03: inserat sectiunea ARC TRANSFORMARE completa in FILM (BOMBA + SUNA
  CUNOSCUT + GRESEALA + AHA + CINE DEVII), lipsea integral; formatare clonata din
  C04, texte din Studiu.
- C04: completat fraza a 2-a din MIZA.
- 10-MAP-FILM-HTML.md: documentat arcul + cover-subtitle<-BOMBA la premium.
Docx editate via word/document.xml + re-zip (integritate verificata). Audit 88/88.
</commit_message>
<xml_diff>
--- a/c02/FILM-Excel-02-Marcare.docx
+++ b/c02/FILM-Excel-02-Marcare.docx
@@ -165,6 +165,90 @@
           <w:sz w:val="20"/>
         </w:rPr>
         <w:t>Încrederea începe după verificare.</w:t>
+      </w:r>
+    </w:p>
+    <w:p>
+      <w:pPr>
+        <w:spacing w:before="200" w:after="80"/>
+      </w:pPr>
+      <w:r>
+        <w:rPr>
+          <w:b/>
+          <w:sz w:val="26"/>
+        </w:rPr>
+        <w:t xml:space="preserve">ARC TRANSFORMARE · CINE DEVINE CURSANTUL</w:t>
+      </w:r>
+    </w:p>
+    <w:p>
+      <w:pPr>
+        <w:spacing w:after="80"/>
+      </w:pPr>
+      <w:r>
+        <w:rPr>
+          <w:rFonts w:ascii="Calibri" w:hAnsi="Calibri"/>
+          <w:sz w:val="20"/>
+        </w:rPr>
+        <w:t xml:space="preserve">Stratul pedagogic din HTML-Studiu (sursa de adevăr a arcului, propagat de aici). Două voci: TU (persoana a II-a) și DATE (tehnic).</w:t>
+      </w:r>
+    </w:p>
+    <w:p>
+      <w:pPr>
+        <w:spacing w:after="80"/>
+      </w:pPr>
+      <w:r>
+        <w:rPr>
+          <w:rFonts w:ascii="Calibri" w:hAnsi="Calibri"/>
+          <w:sz w:val="20"/>
+        </w:rPr>
+        <w:t xml:space="preserve">BOMBA (idee dominantă): Pare curat. Datele mint.</w:t>
+      </w:r>
+    </w:p>
+    <w:p>
+      <w:pPr>
+        <w:spacing w:after="80"/>
+      </w:pPr>
+      <w:r>
+        <w:rPr>
+          <w:rFonts w:ascii="Calibri" w:hAnsi="Calibri"/>
+          <w:sz w:val="20"/>
+        </w:rPr>
+        <w:t xml:space="preserve">SUNĂ CUNOSCUT (recunoaștere): Lucrezi cu un raport care pare în regulă. Și totuși: totaluri care se schimbă după o filtrare; vânzări în week-end pe filiale închise luni-vineri; facturi cu dată din viitor care trec validarea.</w:t>
+      </w:r>
+    </w:p>
+    <w:p>
+      <w:pPr>
+        <w:spacing w:after="80"/>
+      </w:pPr>
+      <w:r>
+        <w:rPr>
+          <w:rFonts w:ascii="Calibri" w:hAnsi="Calibri"/>
+          <w:sz w:val="20"/>
+        </w:rPr>
+        <w:t xml:space="preserve">GREȘEALA CLASICĂ: Oamenii șterg ce pare greșit. Profesioniștii marchează întâi.</w:t>
+      </w:r>
+    </w:p>
+    <w:p>
+      <w:pPr>
+        <w:spacing w:after="80"/>
+      </w:pPr>
+      <w:r>
+        <w:rPr>
+          <w:rFonts w:ascii="Calibri" w:hAnsi="Calibri"/>
+          <w:sz w:val="20"/>
+        </w:rPr>
+        <w:t xml:space="preserve">AHA (vârf): Valid nu înseamnă adevărat.</w:t>
+      </w:r>
+    </w:p>
+    <w:p>
+      <w:pPr>
+        <w:spacing w:after="80"/>
+      </w:pPr>
+      <w:r>
+        <w:rPr>
+          <w:rFonts w:ascii="Calibri" w:hAnsi="Calibri"/>
+          <w:sz w:val="20"/>
+        </w:rPr>
+        <w:t xml:space="preserve">CINE DEVII (promisiune): Nu mai ștergi date. Le pui sub control.</w:t>
       </w:r>
     </w:p>
     <w:p>

</xml_diff>